<commit_message>
fix vertex count check
</commit_message>
<xml_diff>
--- a/report/Отчет_ЛР1.docx
+++ b/report/Отчет_ЛР1.docx
@@ -10297,7 +10297,105 @@
         <w:rPr>
           <w:b w:val="0"/>
         </w:rPr>
-        <w:t>Блок-схема алгоритма упорядочения вершин приведена на рисунке 3, блок-схема алгоритма определения минимального пути — на рисунке 4. Обозначения: A — матрица смежности; P — множество распределенных вершин; N</w:t>
+        <w:t>Блок-схема алгоритма упорядочения вершин приведена на рисунке 3, блок-схема алгоритма определения минимального пути — на рисунке 4.</w:t>
+      </w:r>
+    </w:p>
+    <w:p>
+      <w:pPr>
+        <w:keepNext w:val="0"/>
+        <w:spacing w:after="0"/>
+        <w:ind w:firstLine="709"/>
+        <w:jc w:val="both"/>
+      </w:pPr>
+      <w:r>
+        <w:rPr>
+          <w:b w:val="0"/>
+        </w:rPr>
+        <w:t>Обозначения на рисунке 3:</w:t>
+      </w:r>
+    </w:p>
+    <w:p>
+      <w:pPr>
+        <w:keepNext w:val="0"/>
+        <w:spacing w:after="0"/>
+        <w:ind w:firstLine="709"/>
+        <w:jc w:val="both"/>
+      </w:pPr>
+      <w:r>
+        <w:rPr>
+          <w:b w:val="0"/>
+        </w:rPr>
+        <w:t>— A — матрица смежности графа;</w:t>
+      </w:r>
+    </w:p>
+    <w:p>
+      <w:pPr>
+        <w:keepNext w:val="0"/>
+        <w:spacing w:after="0"/>
+        <w:ind w:firstLine="709"/>
+        <w:jc w:val="both"/>
+      </w:pPr>
+      <w:r>
+        <w:rPr>
+          <w:b w:val="0"/>
+        </w:rPr>
+        <w:t>— n — число вершин графа;</w:t>
+      </w:r>
+    </w:p>
+    <w:p>
+      <w:pPr>
+        <w:keepNext w:val="0"/>
+        <w:spacing w:after="0"/>
+        <w:ind w:firstLine="709"/>
+        <w:jc w:val="both"/>
+      </w:pPr>
+      <w:r>
+        <w:rPr>
+          <w:b w:val="0"/>
+        </w:rPr>
+        <w:t>— P — множество вершин, уже распределенных по уровням (в начале пустое);</w:t>
+      </w:r>
+    </w:p>
+    <w:p>
+      <w:pPr>
+        <w:keepNext w:val="0"/>
+        <w:spacing w:after="0"/>
+        <w:ind w:firstLine="709"/>
+        <w:jc w:val="both"/>
+      </w:pPr>
+      <w:r>
+        <w:rPr>
+          <w:b w:val="0"/>
+        </w:rPr>
+        <w:t>— |P| — число вершин в множестве P;</w:t>
+      </w:r>
+    </w:p>
+    <w:p>
+      <w:pPr>
+        <w:keepNext w:val="0"/>
+        <w:spacing w:after="0"/>
+        <w:ind w:firstLine="709"/>
+        <w:jc w:val="both"/>
+      </w:pPr>
+      <w:r>
+        <w:rPr>
+          <w:b w:val="0"/>
+        </w:rPr>
+        <w:t>— k — номер формируемого уровня (k = 0, 1, 2, …);</w:t>
+      </w:r>
+    </w:p>
+    <w:p>
+      <w:pPr>
+        <w:keepNext w:val="0"/>
+        <w:spacing w:after="0"/>
+        <w:ind w:firstLine="709"/>
+        <w:jc w:val="both"/>
+      </w:pPr>
+      <w:r>
+        <w:rPr>
+          <w:b w:val="0"/>
+        </w:rPr>
+        <w:t>— N</w:t>
       </w:r>
       <w:r>
         <w:rPr>
@@ -10310,7 +10408,35 @@
         <w:rPr>
           <w:b w:val="0"/>
         </w:rPr>
-        <w:t xml:space="preserve"> — множество вершин уровня k; G</w:t>
+        <w:t xml:space="preserve"> — множество вершин уровня k;</w:t>
+      </w:r>
+    </w:p>
+    <w:p>
+      <w:pPr>
+        <w:keepNext w:val="0"/>
+        <w:spacing w:after="0"/>
+        <w:ind w:firstLine="709"/>
+        <w:jc w:val="both"/>
+      </w:pPr>
+      <w:r>
+        <w:rPr>
+          <w:b w:val="0"/>
+        </w:rPr>
+        <w:t>— j — номер проверяемой вершины (j = 1, …, n);</w:t>
+      </w:r>
+    </w:p>
+    <w:p>
+      <w:pPr>
+        <w:keepNext w:val="0"/>
+        <w:spacing w:after="0"/>
+        <w:ind w:firstLine="709"/>
+        <w:jc w:val="both"/>
+      </w:pPr>
+      <w:r>
+        <w:rPr>
+          <w:b w:val="0"/>
+        </w:rPr>
+        <w:t>— G</w:t>
       </w:r>
       <w:r>
         <w:rPr>
@@ -10323,33 +10449,61 @@
         <w:rPr>
           <w:b w:val="0"/>
         </w:rPr>
-        <w:t>(j) — множество вершин, из которых исходят дуги в вершину j; s, t — начальная и конечная вершины; v</w:t>
+        <w:t>(j) — множество вершин, из которых исходят дуги в вершину j;</w:t>
+      </w:r>
+    </w:p>
+    <w:p>
+      <w:pPr>
+        <w:keepNext w:val="0"/>
+        <w:spacing w:after="0"/>
+        <w:ind w:firstLine="709"/>
+        <w:jc w:val="both"/>
+      </w:pPr>
+      <w:r>
+        <w:rPr>
+          <w:b w:val="0"/>
+        </w:rPr>
+        <w:t>— ∅ — пустое множество.</w:t>
+      </w:r>
+    </w:p>
+    <w:p>
+      <w:pPr>
+        <w:keepNext w:val="0"/>
+        <w:spacing w:after="0"/>
+        <w:ind w:firstLine="709"/>
+        <w:jc w:val="both"/>
+      </w:pPr>
+      <w:r>
+        <w:rPr>
+          <w:b w:val="0"/>
+        </w:rPr>
+        <w:t>Вершина j включается в уровень N</w:t>
       </w:r>
       <w:r>
         <w:rPr>
           <w:b w:val="0"/>
           <w:vertAlign w:val="subscript"/>
         </w:rPr>
-        <w:t>1</w:t>
+        <w:t>k</w:t>
       </w:r>
       <w:r>
         <w:rPr>
           <w:b w:val="0"/>
         </w:rPr>
-        <w:t>, …, v</w:t>
+        <w:t>, если она еще не распределена и все вершины, из которых в нее входят дуги, распределены на предыдущих уровнях. Если уровень N</w:t>
       </w:r>
       <w:r>
         <w:rPr>
           <w:b w:val="0"/>
           <w:vertAlign w:val="subscript"/>
         </w:rPr>
-        <w:t>n</w:t>
+        <w:t>k</w:t>
       </w:r>
       <w:r>
         <w:rPr>
           <w:b w:val="0"/>
         </w:rPr>
-        <w:t xml:space="preserve"> — вершины в порядке уровней; j, i, r — счетчики циклов; d[v] — длина минимального пути из s в v; prev[v] — предшествующая вершина на этом пути.</w:t>
+        <w:t xml:space="preserve"> остается пустым, а нераспределенные вершины есть, в графе имеется контур.</w:t>
       </w:r>
     </w:p>
     <w:p>
@@ -10410,6 +10564,264 @@
     </w:p>
     <w:p>
       <w:pPr>
+        <w:keepNext w:val="0"/>
+        <w:spacing w:after="0"/>
+        <w:ind w:firstLine="709"/>
+        <w:jc w:val="both"/>
+      </w:pPr>
+      <w:r>
+        <w:rPr>
+          <w:b w:val="0"/>
+        </w:rPr>
+        <w:t>Обозначения на рисунке 4:</w:t>
+      </w:r>
+    </w:p>
+    <w:p>
+      <w:pPr>
+        <w:keepNext w:val="0"/>
+        <w:spacing w:after="0"/>
+        <w:ind w:firstLine="709"/>
+        <w:jc w:val="both"/>
+      </w:pPr>
+      <w:r>
+        <w:rPr>
+          <w:b w:val="0"/>
+        </w:rPr>
+        <w:t>— A — матрица смежности графа, n — число вершин;</w:t>
+      </w:r>
+    </w:p>
+    <w:p>
+      <w:pPr>
+        <w:keepNext w:val="0"/>
+        <w:spacing w:after="0"/>
+        <w:ind w:firstLine="709"/>
+        <w:jc w:val="both"/>
+      </w:pPr>
+      <w:r>
+        <w:rPr>
+          <w:b w:val="0"/>
+        </w:rPr>
+        <w:t>— a</w:t>
+      </w:r>
+      <w:r>
+        <w:rPr>
+          <w:b w:val="0"/>
+          <w:vertAlign w:val="subscript"/>
+        </w:rPr>
+        <w:t>ij</w:t>
+      </w:r>
+      <w:r>
+        <w:rPr>
+          <w:b w:val="0"/>
+        </w:rPr>
+        <w:t xml:space="preserve"> — цена дуги (i, j), значение 0 означает отсутствие дуги;</w:t>
+      </w:r>
+    </w:p>
+    <w:p>
+      <w:pPr>
+        <w:keepNext w:val="0"/>
+        <w:spacing w:after="0"/>
+        <w:ind w:firstLine="709"/>
+        <w:jc w:val="both"/>
+      </w:pPr>
+      <w:r>
+        <w:rPr>
+          <w:b w:val="0"/>
+        </w:rPr>
+        <w:t>— s, t — начальная и конечная вершины;</w:t>
+      </w:r>
+    </w:p>
+    <w:p>
+      <w:pPr>
+        <w:keepNext w:val="0"/>
+        <w:spacing w:after="0"/>
+        <w:ind w:firstLine="709"/>
+        <w:jc w:val="both"/>
+      </w:pPr>
+      <w:r>
+        <w:rPr>
+          <w:b w:val="0"/>
+        </w:rPr>
+        <w:t>— v</w:t>
+      </w:r>
+      <w:r>
+        <w:rPr>
+          <w:b w:val="0"/>
+          <w:vertAlign w:val="subscript"/>
+        </w:rPr>
+        <w:t>1</w:t>
+      </w:r>
+      <w:r>
+        <w:rPr>
+          <w:b w:val="0"/>
+        </w:rPr>
+        <w:t>, …, v</w:t>
+      </w:r>
+      <w:r>
+        <w:rPr>
+          <w:b w:val="0"/>
+          <w:vertAlign w:val="subscript"/>
+        </w:rPr>
+        <w:t>n</w:t>
+      </w:r>
+      <w:r>
+        <w:rPr>
+          <w:b w:val="0"/>
+        </w:rPr>
+        <w:t xml:space="preserve"> — все вершины графа, выписанные подряд по уровням N</w:t>
+      </w:r>
+      <w:r>
+        <w:rPr>
+          <w:b w:val="0"/>
+          <w:vertAlign w:val="subscript"/>
+        </w:rPr>
+        <w:t>0</w:t>
+      </w:r>
+      <w:r>
+        <w:rPr>
+          <w:b w:val="0"/>
+        </w:rPr>
+        <w:t>, N</w:t>
+      </w:r>
+      <w:r>
+        <w:rPr>
+          <w:b w:val="0"/>
+          <w:vertAlign w:val="subscript"/>
+        </w:rPr>
+        <w:t>1</w:t>
+      </w:r>
+      <w:r>
+        <w:rPr>
+          <w:b w:val="0"/>
+        </w:rPr>
+        <w:t>, …;</w:t>
+      </w:r>
+    </w:p>
+    <w:p>
+      <w:pPr>
+        <w:keepNext w:val="0"/>
+        <w:spacing w:after="0"/>
+        <w:ind w:firstLine="709"/>
+        <w:jc w:val="both"/>
+      </w:pPr>
+      <w:r>
+        <w:rPr>
+          <w:b w:val="0"/>
+        </w:rPr>
+        <w:t>— r — номер вершины в последовательности v</w:t>
+      </w:r>
+      <w:r>
+        <w:rPr>
+          <w:b w:val="0"/>
+          <w:vertAlign w:val="subscript"/>
+        </w:rPr>
+        <w:t>1</w:t>
+      </w:r>
+      <w:r>
+        <w:rPr>
+          <w:b w:val="0"/>
+        </w:rPr>
+        <w:t>, …, v</w:t>
+      </w:r>
+      <w:r>
+        <w:rPr>
+          <w:b w:val="0"/>
+          <w:vertAlign w:val="subscript"/>
+        </w:rPr>
+        <w:t>n</w:t>
+      </w:r>
+      <w:r>
+        <w:rPr>
+          <w:b w:val="0"/>
+        </w:rPr>
+        <w:t xml:space="preserve"> (r = 1, …, n);</w:t>
+      </w:r>
+    </w:p>
+    <w:p>
+      <w:pPr>
+        <w:keepNext w:val="0"/>
+        <w:spacing w:after="0"/>
+        <w:ind w:firstLine="709"/>
+        <w:jc w:val="both"/>
+      </w:pPr>
+      <w:r>
+        <w:rPr>
+          <w:b w:val="0"/>
+        </w:rPr>
+        <w:t>— j — обрабатываемая вершина (j = v</w:t>
+      </w:r>
+      <w:r>
+        <w:rPr>
+          <w:b w:val="0"/>
+          <w:vertAlign w:val="subscript"/>
+        </w:rPr>
+        <w:t>r</w:t>
+      </w:r>
+      <w:r>
+        <w:rPr>
+          <w:b w:val="0"/>
+        </w:rPr>
+        <w:t>);</w:t>
+      </w:r>
+    </w:p>
+    <w:p>
+      <w:pPr>
+        <w:keepNext w:val="0"/>
+        <w:spacing w:after="0"/>
+        <w:ind w:firstLine="709"/>
+        <w:jc w:val="both"/>
+      </w:pPr>
+      <w:r>
+        <w:rPr>
+          <w:b w:val="0"/>
+        </w:rPr>
+        <w:t>— i — вершина, из которой может входить дуга в вершину j (i = 1, …, n);</w:t>
+      </w:r>
+    </w:p>
+    <w:p>
+      <w:pPr>
+        <w:keepNext w:val="0"/>
+        <w:spacing w:after="0"/>
+        <w:ind w:firstLine="709"/>
+        <w:jc w:val="both"/>
+      </w:pPr>
+      <w:r>
+        <w:rPr>
+          <w:b w:val="0"/>
+        </w:rPr>
+        <w:t>— d[v] — длина минимального пути из s в вершину v;</w:t>
+      </w:r>
+    </w:p>
+    <w:p>
+      <w:pPr>
+        <w:keepNext w:val="0"/>
+        <w:spacing w:after="0"/>
+        <w:ind w:firstLine="709"/>
+        <w:jc w:val="both"/>
+      </w:pPr>
+      <w:r>
+        <w:rPr>
+          <w:b w:val="0"/>
+        </w:rPr>
+        <w:t>— ∞ — признак того, что путь в вершину не найден;</w:t>
+      </w:r>
+    </w:p>
+    <w:p>
+      <w:pPr>
+        <w:keepNext w:val="0"/>
+        <w:spacing w:after="0"/>
+        <w:ind w:firstLine="709"/>
+        <w:jc w:val="both"/>
+      </w:pPr>
+      <w:r>
+        <w:rPr>
+          <w:b w:val="0"/>
+        </w:rPr>
+        <w:t>— prev[v] — вершина, предшествующая v на минимальном пути (−1 — предшествующей вершины нет).</w:t>
+      </w:r>
+    </w:p>
+    <w:p>
+      <w:pPr>
         <w:keepNext/>
         <w:spacing w:before="120" w:line="240" w:lineRule="auto"/>
         <w:ind w:firstLine="0"/>
@@ -13038,7 +13450,7 @@
           <w:rFonts w:ascii="Courier New" w:hAnsi="Courier New" w:cs="Courier New" w:eastAsia="Courier New"/>
           <w:sz w:val="16"/>
         </w:rPr>
-        <w:t>n = col1.number_input("Количество вершин", min_value=2, max_value=MAX_VERTICES, step=1, key="n")</w:t>
+        <w:t># границы проверяем сами, чтобы сообщение было на русском</w:t>
       </w:r>
     </w:p>
     <w:p>
@@ -13051,7 +13463,7 @@
           <w:rFonts w:ascii="Courier New" w:hAnsi="Courier New" w:cs="Courier New" w:eastAsia="Courier New"/>
           <w:sz w:val="16"/>
         </w:rPr>
-        <w:t>col2.write("")</w:t>
+        <w:t>n = col1.number_input("Количество вершин", step=1, key="n")</w:t>
       </w:r>
     </w:p>
     <w:p>
@@ -13064,7 +13476,72 @@
           <w:rFonts w:ascii="Courier New" w:hAnsi="Courier New" w:cs="Courier New" w:eastAsia="Courier New"/>
           <w:sz w:val="16"/>
         </w:rPr>
+        <w:t>col2.write("")</w:t>
+      </w:r>
+    </w:p>
+    <w:p>
+      <w:pPr>
+        <w:spacing w:line="240" w:lineRule="auto"/>
+        <w:ind w:firstLine="0"/>
+      </w:pPr>
+      <w:r>
+        <w:rPr>
+          <w:rFonts w:ascii="Courier New" w:hAnsi="Courier New" w:cs="Courier New" w:eastAsia="Courier New"/>
+          <w:sz w:val="16"/>
+        </w:rPr>
         <w:t>col2.button("Вернуть данные варианта 1", on_click=reset_to_variant)</w:t>
+      </w:r>
+    </w:p>
+    <w:p>
+      <w:pPr>
+        <w:spacing w:line="240" w:lineRule="auto"/>
+        <w:ind w:firstLine="0"/>
+      </w:pPr>
+      <w:r>
+        <w:rPr>
+          <w:rFonts w:ascii="Courier New" w:hAnsi="Courier New" w:cs="Courier New" w:eastAsia="Courier New"/>
+          <w:sz w:val="16"/>
+        </w:rPr>
+        <w:t xml:space="preserve"> </w:t>
+      </w:r>
+    </w:p>
+    <w:p>
+      <w:pPr>
+        <w:spacing w:line="240" w:lineRule="auto"/>
+        <w:ind w:firstLine="0"/>
+      </w:pPr>
+      <w:r>
+        <w:rPr>
+          <w:rFonts w:ascii="Courier New" w:hAnsi="Courier New" w:cs="Courier New" w:eastAsia="Courier New"/>
+          <w:sz w:val="16"/>
+        </w:rPr>
+        <w:t>if not 2 &lt;= n &lt;= MAX_VERTICES:</w:t>
+      </w:r>
+    </w:p>
+    <w:p>
+      <w:pPr>
+        <w:spacing w:line="240" w:lineRule="auto"/>
+        <w:ind w:firstLine="0"/>
+      </w:pPr>
+      <w:r>
+        <w:rPr>
+          <w:rFonts w:ascii="Courier New" w:hAnsi="Courier New" w:cs="Courier New" w:eastAsia="Courier New"/>
+          <w:sz w:val="16"/>
+        </w:rPr>
+        <w:t xml:space="preserve">    st.error(f"Количество вершин должно быть от 2 до {MAX_VERTICES}, введено {n}.")</w:t>
+      </w:r>
+    </w:p>
+    <w:p>
+      <w:pPr>
+        <w:spacing w:line="240" w:lineRule="auto"/>
+        <w:ind w:firstLine="0"/>
+      </w:pPr>
+      <w:r>
+        <w:rPr>
+          <w:rFonts w:ascii="Courier New" w:hAnsi="Courier New" w:cs="Courier New" w:eastAsia="Courier New"/>
+          <w:sz w:val="16"/>
+        </w:rPr>
+        <w:t xml:space="preserve">    st.stop()</w:t>
       </w:r>
     </w:p>
     <w:p>
@@ -14885,6 +15362,86 @@
                 <w:sz w:val="24"/>
               </w:rPr>
               <w:t>Рисунок</w:t>
+            </w:r>
+          </w:p>
+        </w:tc>
+      </w:tr>
+      <w:tr>
+        <w:tc>
+          <w:tcPr>
+            <w:tcW w:type="dxa" w:w="3118"/>
+            <w:vAlign w:val="center"/>
+          </w:tcPr>
+          <w:p>
+            <w:pPr>
+              <w:keepNext/>
+              <w:spacing w:line="240" w:lineRule="auto"/>
+              <w:ind w:firstLine="0"/>
+              <w:jc w:val="left"/>
+            </w:pPr>
+            <w:r>
+              <w:rPr>
+                <w:sz w:val="24"/>
+              </w:rPr>
+            </w:r>
+            <w:r>
+              <w:rPr>
+                <w:b w:val="0"/>
+                <w:sz w:val="24"/>
+              </w:rPr>
+              <w:t>Количество вершин меньше 2 или больше 30</w:t>
+            </w:r>
+          </w:p>
+        </w:tc>
+        <w:tc>
+          <w:tcPr>
+            <w:tcW w:type="dxa" w:w="4819"/>
+            <w:vAlign w:val="center"/>
+          </w:tcPr>
+          <w:p>
+            <w:pPr>
+              <w:keepNext/>
+              <w:spacing w:line="240" w:lineRule="auto"/>
+              <w:ind w:firstLine="0"/>
+              <w:jc w:val="left"/>
+            </w:pPr>
+            <w:r>
+              <w:rPr>
+                <w:sz w:val="24"/>
+              </w:rPr>
+            </w:r>
+            <w:r>
+              <w:rPr>
+                <w:b w:val="0"/>
+                <w:sz w:val="24"/>
+              </w:rPr>
+              <w:t>Выводится сообщение «Количество вершин должно быть от 2 до 30»; расчет прекращается</w:t>
+            </w:r>
+          </w:p>
+        </w:tc>
+        <w:tc>
+          <w:tcPr>
+            <w:tcW w:type="dxa" w:w="1417"/>
+            <w:vAlign w:val="center"/>
+          </w:tcPr>
+          <w:p>
+            <w:pPr>
+              <w:keepNext/>
+              <w:spacing w:line="240" w:lineRule="auto"/>
+              <w:ind w:firstLine="0"/>
+              <w:jc w:val="center"/>
+            </w:pPr>
+            <w:r>
+              <w:rPr>
+                <w:sz w:val="24"/>
+              </w:rPr>
+            </w:r>
+            <w:r>
+              <w:rPr>
+                <w:b w:val="0"/>
+                <w:sz w:val="24"/>
+              </w:rPr>
+              <w:t>–</w:t>
             </w:r>
           </w:p>
         </w:tc>

</xml_diff>